<commit_message>
i forgot what this was fuck omg
</commit_message>
<xml_diff>
--- a/assets/invoices/verify_dock1_live.docx
+++ b/assets/invoices/verify_dock1_live.docx
@@ -1331,6 +1331,51 @@
           <w:color w:val="12233F"/>
           <w:sz w:val="26"/>
         </w:rPr>
+        <w:t>REJECTED / NOT LOADED PACKAGES</w:t>
+      </w:r>
+    </w:p>
+    <w:p>
+      <w:pPr>
+        <w:spacing w:before="0" w:after="120"/>
+        <w:jc w:val="center"/>
+      </w:pPr>
+      <w:r>
+        <w:rPr>
+          <w:rFonts w:ascii="Calibri" w:hAnsi="Calibri"/>
+          <w:b w:val="0"/>
+          <w:color w:val="64748B"/>
+          <w:sz w:val="15"/>
+        </w:rPr>
+        <w:t>Manifest packages refused by truck constraints (weight, footprint stability, or space)</w:t>
+      </w:r>
+    </w:p>
+    <w:p>
+      <w:pPr>
+        <w:spacing w:before="0" w:after="40"/>
+        <w:jc w:val="center"/>
+      </w:pPr>
+      <w:r>
+        <w:rPr>
+          <w:rFonts w:ascii="Calibri" w:hAnsi="Calibri"/>
+          <w:b w:val="0"/>
+          <w:color w:val="64748B"/>
+          <w:sz w:val="16"/>
+        </w:rPr>
+        <w:t>All manifest items packed and loaded.</w:t>
+      </w:r>
+    </w:p>
+    <w:p>
+      <w:pPr>
+        <w:spacing w:before="280" w:after="20"/>
+        <w:jc w:val="center"/>
+      </w:pPr>
+      <w:r>
+        <w:rPr>
+          <w:rFonts w:ascii="Calibri" w:hAnsi="Calibri"/>
+          <w:b/>
+          <w:color w:val="12233F"/>
+          <w:sz w:val="26"/>
+        </w:rPr>
         <w:t>UNLOADING SEQUENCE</w:t>
       </w:r>
     </w:p>

</xml_diff>

<commit_message>
Integrated truck ID as truck selection
</commit_message>
<xml_diff>
--- a/assets/invoices/verify_dock1_live.docx
+++ b/assets/invoices/verify_dock1_live.docx
@@ -243,6 +243,7 @@
     </w:tbl>
     <w:p>
       <w:pPr>
+        <w:keepNext/>
         <w:spacing w:before="280" w:after="20"/>
         <w:jc w:val="center"/>
       </w:pPr>
@@ -258,6 +259,7 @@
     </w:p>
     <w:p>
       <w:pPr>
+        <w:keepNext/>
         <w:spacing w:before="0" w:after="120"/>
         <w:jc w:val="center"/>
       </w:pPr>
@@ -512,6 +514,7 @@
     </w:tbl>
     <w:p>
       <w:pPr>
+        <w:keepNext/>
         <w:spacing w:before="280" w:after="20"/>
         <w:jc w:val="center"/>
       </w:pPr>
@@ -557,6 +560,7 @@
     </w:p>
     <w:p>
       <w:pPr>
+        <w:keepNext/>
         <w:spacing w:before="280" w:after="20"/>
         <w:jc w:val="center"/>
       </w:pPr>
@@ -668,6 +672,7 @@
     </w:p>
     <w:p>
       <w:pPr>
+        <w:keepNext/>
         <w:spacing w:before="280" w:after="20"/>
         <w:jc w:val="center"/>
       </w:pPr>
@@ -764,6 +769,7 @@
     </w:p>
     <w:p>
       <w:pPr>
+        <w:keepNext/>
         <w:spacing w:before="280" w:after="20"/>
         <w:jc w:val="center"/>
       </w:pPr>
@@ -779,6 +785,7 @@
     </w:p>
     <w:p>
       <w:pPr>
+        <w:keepNext/>
         <w:spacing w:before="0" w:after="120"/>
         <w:jc w:val="center"/>
       </w:pPr>
@@ -1321,6 +1328,7 @@
     </w:tbl>
     <w:p>
       <w:pPr>
+        <w:keepNext/>
         <w:spacing w:before="280" w:after="20"/>
         <w:jc w:val="center"/>
       </w:pPr>
@@ -1336,6 +1344,7 @@
     </w:p>
     <w:p>
       <w:pPr>
+        <w:keepNext/>
         <w:spacing w:before="0" w:after="120"/>
         <w:jc w:val="center"/>
       </w:pPr>
@@ -1366,6 +1375,7 @@
     </w:p>
     <w:p>
       <w:pPr>
+        <w:keepNext/>
         <w:spacing w:before="280" w:after="20"/>
         <w:jc w:val="center"/>
       </w:pPr>

</xml_diff>